<commit_message>
sigma: procurações — geração automática sem IA (substituição de template)
- Remove dependência da Claude API (zero créditos consumidos)
- Geração instantânea: formulário → substituição nos runs do DOCX → download
- Documento final idêntico ao template (mesma fonte, negrito, espaçamento)
- Formatação automática: razão social/nomes em CAIXA ALTA, município em
  Title Case, CPF/CNPJ/CEP formatados independente de como foram digitados
- 5 templates atualizados com placeholders {{CAMPO}} em runs específicos
- Arquivos _ORIG preservados para download do modelo em branco
- Formulário redesenhado com campos por modelo (show/hide por tipo)
- Validação de campos obrigatórios por tipo de procuração

Co-Authored-By: Claude Sonnet 4.6 <noreply@anthropic.com>
</commit_message>
<xml_diff>
--- a/static/modelos_procuracao/procuracao_para_servicos_externos_terceirizado.docx
+++ b/static/modelos_procuracao/procuracao_para_servicos_externos_terceirizado.docx
@@ -27,7 +27,7 @@
           <w:b w:val="0"/>
           <w:sz w:val="24"/>
         </w:rPr>
-        <w:t>OUTORGANTE: [RAZÃO SOCIAL], pessoa jurídica de direito privado, inscrita no CNPJ sob o nº [CNPJ], com sede em [ENDEREÇO COMPLETO], neste ato representada por [NOME DO REPRESENTANTE], [estado civil], [profissão/cargo], portador(a) da Cédula de Identidade RG nº [RG] e CPF nº [CPF];</w:t>
+        <w:t>OUTORGANTE: {{RAZAO_SOCIAL}}, pessoa jurídica de direito privado, inscrita no CNPJ sob o nº {{CNPJ}}, com sede em {{ENDERECO}}, neste ato representada por {{NOME_REPRESENTANTE}}, {{ESTADO_CIVIL}}, {{PROFISSAO}}, portador(a) da Cédula de Identidade RG nº {{RG_REPRESENTANTE}} e CPF nº {{CPF_REPRESENTANTE}};</w:t>
       </w:r>
     </w:p>
     <w:p>
@@ -45,7 +45,7 @@
           <w:b w:val="0"/>
           <w:sz w:val="24"/>
         </w:rPr>
-        <w:t>OUTORGADO(A): [NOME COMPLETO], [estado civil], [profissão], portador(a) da Cédula de Identidade RG nº [RG] e CPF nº [CPF], residente e domiciliado(a) à [ENDEREÇO COMPLETO];</w:t>
+        <w:t>OUTORGADO(A): {{NOME_OUTORGADO}}, {{ESTADO_CIVIL}}, {{PROFISSAO_OUTORGADO}}, portador(a) da Cédula de Identidade RG nº {{RG_REPRESENTANTE}} e CPF nº {{CPF_REPRESENTANTE}}, residente e domiciliado(a) à {{ENDERECO}};</w:t>
       </w:r>
     </w:p>
     <w:p>
@@ -63,7 +63,7 @@
           <w:b w:val="0"/>
           <w:sz w:val="24"/>
         </w:rPr>
-        <w:t>PODERES: Pelo presente instrumento particular de procuração, o(a) OUTORGANTE nomeia e constitui o(a) acima qualificado(a) como seu bastante procurador(a), para [DESCREVER OS PODERES: representar a empresa, assinar documentos, praticar atos junto a órgãos públicos e privados, etc.], podendo para tanto praticar todos os atos necessários ao fiel cumprimento deste mandato.</w:t>
+        <w:t>PODERES: Pelo presente instrumento particular de procuração, o(a) OUTORGANTE nomeia e constitui o(a) acima qualificado(a) como seu bastante procurador(a), para {{PODERES}}, podendo para tanto praticar todos os atos necessários ao fiel cumprimento deste mandato.</w:t>
       </w:r>
     </w:p>
     <w:p>
@@ -81,7 +81,7 @@
           <w:b w:val="0"/>
           <w:sz w:val="24"/>
         </w:rPr>
-        <w:t>A presente procuração é conferida com prazo de validade de [VIGÊNCIA / "por prazo indeterminado"], podendo ser revogada a qualquer tempo por instrumento escrito.</w:t>
+        <w:t>A presente procuração é conferida com prazo de validade de {{VIGENCIA}}, podendo ser revogada a qualquer tempo por instrumento escrito.</w:t>
       </w:r>
     </w:p>
     <w:p>
@@ -104,7 +104,7 @@
           <w:b w:val="0"/>
           <w:sz w:val="24"/>
         </w:rPr>
-        <w:t>Goiânia, ___ de __________________ de 20___.</w:t>
+        <w:t>Goiânia, {{DATA_EXTENSO}}</w:t>
       </w:r>
     </w:p>
     <w:p>
@@ -140,7 +140,7 @@
           <w:b w:val="0"/>
           <w:sz w:val="24"/>
         </w:rPr>
-        <w:t>[NOME DO REPRESENTANTE]</w:t>
+        <w:t>{{NOME_REPRESENTANTE}}</w:t>
       </w:r>
     </w:p>
     <w:p>

</xml_diff>

<commit_message>
procuracoes: fix cor vermelha + ORIG correto (Serviços Externos)
- Removidos 14 runs com color=C00000 (vermelho SDT) do template de preenchimento
  → documentos gerados saem com texto preto
- ORIG substituído pelo modelo original da rede (estrutura correta: PROCURAÇÃO,
  vedado o substabelecimento, endereço fixo Sigma, rodapé com endereço completo)

Co-Authored-By: Claude Sonnet 4.6 <noreply@anthropic.com>
</commit_message>
<xml_diff>
--- a/static/modelos_procuracao/procuracao_para_servicos_externos_terceirizado.docx
+++ b/static/modelos_procuracao/procuracao_para_servicos_externos_terceirizado.docx
@@ -120,7 +120,6 @@
         <w:rPr>
           <w:rStyle w:val="TextodoEspaoReservado"/>
           <w:rFonts w:ascii="Times New Roman" w:hAnsi="Times New Roman" w:cs="Times New Roman"/>
-          <w:color w:val="C00000"/>
         </w:rPr>
         <w:t xml:space="preserve">{{RAZAO_SOCIAL}}</w:t>
       </w:r>
@@ -146,7 +145,6 @@
         <w:rPr>
           <w:rStyle w:val="TextodoEspaoReservado"/>
           <w:rFonts w:ascii="Times New Roman" w:hAnsi="Times New Roman" w:cs="Times New Roman"/>
-          <w:color w:val="C00000"/>
         </w:rPr>
         <w:t xml:space="preserve">{{ENDERECO}}</w:t>
       </w:r>
@@ -184,7 +182,6 @@
         <w:rPr>
           <w:rStyle w:val="TextodoEspaoReservado"/>
           <w:rFonts w:ascii="Times New Roman" w:hAnsi="Times New Roman" w:cs="Times New Roman"/>
-          <w:color w:val="C00000"/>
         </w:rPr>
         <w:t xml:space="preserve">{{CNPJ}}</w:t>
       </w:r>
@@ -211,7 +208,6 @@
         <w:rPr>
           <w:rStyle w:val="TextodoEspaoReservado"/>
           <w:rFonts w:ascii="Times New Roman" w:hAnsi="Times New Roman" w:cs="Times New Roman"/>
-          <w:color w:val="C00000"/>
         </w:rPr>
         <w:t xml:space="preserve">{{NOME_REPRESENTANTE}}</w:t>
       </w:r>
@@ -228,7 +224,6 @@
         <w:rPr>
           <w:rStyle w:val="TextodoEspaoReservado"/>
           <w:rFonts w:ascii="Times New Roman" w:hAnsi="Times New Roman" w:cs="Times New Roman"/>
-          <w:color w:val="C00000"/>
         </w:rPr>
         <w:t xml:space="preserve">{{NACIONALIDADE}}</w:t>
       </w:r>
@@ -245,7 +240,6 @@
         <w:rPr>
           <w:rStyle w:val="TextodoEspaoReservado"/>
           <w:rFonts w:ascii="Times New Roman" w:hAnsi="Times New Roman" w:cs="Times New Roman"/>
-          <w:color w:val="C00000"/>
         </w:rPr>
         <w:t xml:space="preserve">{{ESTADO_CIVIL}}</w:t>
       </w:r>
@@ -262,7 +256,6 @@
         <w:rPr>
           <w:rStyle w:val="TextodoEspaoReservado"/>
           <w:rFonts w:ascii="Times New Roman" w:hAnsi="Times New Roman" w:cs="Times New Roman"/>
-          <w:color w:val="C00000"/>
         </w:rPr>
         <w:t xml:space="preserve">{{PROFISSAO}}</w:t>
       </w:r>
@@ -279,7 +272,6 @@
         <w:rPr>
           <w:rStyle w:val="TextodoEspaoReservado"/>
           <w:rFonts w:ascii="Times New Roman" w:hAnsi="Times New Roman" w:cs="Times New Roman"/>
-          <w:color w:val="C00000"/>
         </w:rPr>
         <w:t xml:space="preserve">{{DOMICILIO_REPRESENTANTE}}</w:t>
       </w:r>
@@ -316,7 +308,6 @@
         <w:rPr>
           <w:rStyle w:val="TextodoEspaoReservado"/>
           <w:rFonts w:ascii="Times New Roman" w:hAnsi="Times New Roman" w:cs="Times New Roman"/>
-          <w:color w:val="C00000"/>
         </w:rPr>
         <w:t xml:space="preserve">{{CPF_REPRESENTANTE}}</w:t>
       </w:r>
@@ -368,7 +359,6 @@
           <w:rStyle w:val="TextodoEspaoReservado"/>
           <w:rFonts w:ascii="Times New Roman" w:hAnsi="Times New Roman" w:cs="Times New Roman"/>
           <w:b/>
-          <w:color w:val="C00000"/>
         </w:rPr>
         <w:t xml:space="preserve">{{NOME_OUTORGADO}}</w:t>
       </w:r>
@@ -382,7 +372,6 @@
         <w:rPr>
           <w:rStyle w:val="TextodoEspaoReservado"/>
           <w:rFonts w:ascii="Times New Roman" w:hAnsi="Times New Roman" w:cs="Times New Roman"/>
-          <w:color w:val="C00000"/>
         </w:rPr>
         <w:t xml:space="preserve">{{CPF_OUTORGADO}}</w:t>
       </w:r>
@@ -648,7 +637,6 @@
         <w:rPr>
           <w:rStyle w:val="TextodoEspaoReservado"/>
           <w:rFonts w:ascii="Times New Roman" w:hAnsi="Times New Roman" w:cs="Times New Roman"/>
-          <w:color w:val="C00000"/>
         </w:rPr>
         <w:t xml:space="preserve">{{ORGAO}}</w:t>
       </w:r>
@@ -802,7 +790,6 @@
         <w:rPr>
           <w:rStyle w:val="TextodoEspaoReservado"/>
           <w:rFonts w:ascii="Times New Roman" w:hAnsi="Times New Roman" w:cs="Times New Roman"/>
-          <w:color w:val="C00000"/>
         </w:rPr>
         <w:t xml:space="preserve">{{VIGENCIA}}</w:t>
       </w:r>
@@ -860,7 +847,6 @@
         <w:rPr>
           <w:rStyle w:val="TextodoEspaoReservado"/>
           <w:rFonts w:ascii="Times New Roman" w:hAnsi="Times New Roman" w:cs="Times New Roman"/>
-          <w:color w:val="C00000"/>
         </w:rPr>
         <w:t xml:space="preserve">{{MUNICIPIO_UF}}</w:t>
       </w:r>

</xml_diff>

<commit_message>
procuracoes: fix texto cinza - remover rStyle TextodoEspaoReservado
Runs convertidos dos SDTs herdavam o estilo 'Placeholder Text' do Word
(color #808080 cinza). Removidos 15 rStyle dos runs do template.
Texto gerado sairá preto como os demais runs do documento.

Co-Authored-By: Claude Sonnet 4.6 <noreply@anthropic.com>
</commit_message>
<xml_diff>
--- a/static/modelos_procuracao/procuracao_para_servicos_externos_terceirizado.docx
+++ b/static/modelos_procuracao/procuracao_para_servicos_externos_terceirizado.docx
@@ -118,7 +118,6 @@
       </w:r>
       <w:r>
         <w:rPr>
-          <w:rStyle w:val="TextodoEspaoReservado"/>
           <w:rFonts w:ascii="Times New Roman" w:hAnsi="Times New Roman" w:cs="Times New Roman"/>
         </w:rPr>
         <w:t xml:space="preserve">{{RAZAO_SOCIAL}}</w:t>
@@ -143,7 +142,6 @@
       </w:r>
       <w:r>
         <w:rPr>
-          <w:rStyle w:val="TextodoEspaoReservado"/>
           <w:rFonts w:ascii="Times New Roman" w:hAnsi="Times New Roman" w:cs="Times New Roman"/>
         </w:rPr>
         <w:t xml:space="preserve">{{ENDERECO}}</w:t>
@@ -180,7 +178,6 @@
       </w:r>
       <w:r>
         <w:rPr>
-          <w:rStyle w:val="TextodoEspaoReservado"/>
           <w:rFonts w:ascii="Times New Roman" w:hAnsi="Times New Roman" w:cs="Times New Roman"/>
         </w:rPr>
         <w:t xml:space="preserve">{{CNPJ}}</w:t>
@@ -206,7 +203,6 @@
       </w:r>
       <w:r>
         <w:rPr>
-          <w:rStyle w:val="TextodoEspaoReservado"/>
           <w:rFonts w:ascii="Times New Roman" w:hAnsi="Times New Roman" w:cs="Times New Roman"/>
         </w:rPr>
         <w:t xml:space="preserve">{{NOME_REPRESENTANTE}}</w:t>
@@ -222,7 +218,6 @@
       </w:r>
       <w:r>
         <w:rPr>
-          <w:rStyle w:val="TextodoEspaoReservado"/>
           <w:rFonts w:ascii="Times New Roman" w:hAnsi="Times New Roman" w:cs="Times New Roman"/>
         </w:rPr>
         <w:t xml:space="preserve">{{NACIONALIDADE}}</w:t>
@@ -238,7 +233,6 @@
       </w:r>
       <w:r>
         <w:rPr>
-          <w:rStyle w:val="TextodoEspaoReservado"/>
           <w:rFonts w:ascii="Times New Roman" w:hAnsi="Times New Roman" w:cs="Times New Roman"/>
         </w:rPr>
         <w:t xml:space="preserve">{{ESTADO_CIVIL}}</w:t>
@@ -254,7 +248,6 @@
       </w:r>
       <w:r>
         <w:rPr>
-          <w:rStyle w:val="TextodoEspaoReservado"/>
           <w:rFonts w:ascii="Times New Roman" w:hAnsi="Times New Roman" w:cs="Times New Roman"/>
         </w:rPr>
         <w:t xml:space="preserve">{{PROFISSAO}}</w:t>
@@ -270,7 +263,6 @@
       </w:r>
       <w:r>
         <w:rPr>
-          <w:rStyle w:val="TextodoEspaoReservado"/>
           <w:rFonts w:ascii="Times New Roman" w:hAnsi="Times New Roman" w:cs="Times New Roman"/>
         </w:rPr>
         <w:t xml:space="preserve">{{DOMICILIO_REPRESENTANTE}}</w:t>
@@ -306,7 +298,6 @@
       </w:r>
       <w:r>
         <w:rPr>
-          <w:rStyle w:val="TextodoEspaoReservado"/>
           <w:rFonts w:ascii="Times New Roman" w:hAnsi="Times New Roman" w:cs="Times New Roman"/>
         </w:rPr>
         <w:t xml:space="preserve">{{CPF_REPRESENTANTE}}</w:t>
@@ -356,7 +347,6 @@
       </w:pPr>
       <w:r>
         <w:rPr>
-          <w:rStyle w:val="TextodoEspaoReservado"/>
           <w:rFonts w:ascii="Times New Roman" w:hAnsi="Times New Roman" w:cs="Times New Roman"/>
           <w:b/>
         </w:rPr>
@@ -370,7 +360,6 @@
       </w:r>
       <w:r>
         <w:rPr>
-          <w:rStyle w:val="TextodoEspaoReservado"/>
           <w:rFonts w:ascii="Times New Roman" w:hAnsi="Times New Roman" w:cs="Times New Roman"/>
         </w:rPr>
         <w:t xml:space="preserve">{{CPF_OUTORGADO}}</w:t>
@@ -635,7 +624,6 @@
       </w:pPr>
       <w:r>
         <w:rPr>
-          <w:rStyle w:val="TextodoEspaoReservado"/>
           <w:rFonts w:ascii="Times New Roman" w:hAnsi="Times New Roman" w:cs="Times New Roman"/>
         </w:rPr>
         <w:t xml:space="preserve">{{ORGAO}}</w:t>
@@ -788,7 +776,6 @@
       </w:r>
       <w:r>
         <w:rPr>
-          <w:rStyle w:val="TextodoEspaoReservado"/>
           <w:rFonts w:ascii="Times New Roman" w:hAnsi="Times New Roman" w:cs="Times New Roman"/>
         </w:rPr>
         <w:t xml:space="preserve">{{VIGENCIA}}</w:t>
@@ -845,7 +832,6 @@
       </w:pPr>
       <w:r>
         <w:rPr>
-          <w:rStyle w:val="TextodoEspaoReservado"/>
           <w:rFonts w:ascii="Times New Roman" w:hAnsi="Times New Roman" w:cs="Times New Roman"/>
         </w:rPr>
         <w:t xml:space="preserve">{{MUNICIPIO_UF}}</w:t>
@@ -859,9 +845,7 @@
         <w:t xml:space="preserve">, </w:t>
       </w:r>
       <w:r>
-        <w:rPr>
-          <w:rStyle w:val="TextodoEspaoReservado"/>
-        </w:rPr>
+        <w:rPr/>
         <w:t xml:space="preserve">{{DATA_EXTENSO}}</w:t>
       </w:r>
       <w:r>

</xml_diff>